<commit_message>
feat(agent): add verified PPTX and improve document design
</commit_message>
<xml_diff>
--- a/regulai/front/agents/runtime/templates/corporate.docx
+++ b/regulai/front/agents/runtime/templates/corporate.docx
@@ -15,7 +15,20 @@
         <w:pStyle w:val="Subtitle"/>
       </w:pPr>
       <w:r>
-        <w:t>España · Informe económico</w:t>
+        <w:t>INFORME ECONÓMICO  ·  ESPAÑA</w:t>
+      </w:r>
+    </w:p>
+    <w:p>
+      <w:pPr>
+        <w:pStyle w:val="Heading1"/>
+      </w:pPr>
+      <w:r>
+        <w:t>Resumen ejecutivo</w:t>
+      </w:r>
+    </w:p>
+    <w:p>
+      <w:r>
+        <w:t>{{SUMMARY}}</w:t>
       </w:r>
     </w:p>
     <w:p>
@@ -32,31 +45,10 @@
     </w:p>
     <w:p>
       <w:pPr>
-        <w:pStyle w:val="Heading1"/>
+        <w:pStyle w:val="Subtitle"/>
       </w:pPr>
       <w:r>
-        <w:t>Resumen ejecutivo</w:t>
-      </w:r>
-    </w:p>
-    <w:p>
-      <w:r>
-        <w:t>{{SUMMARY}}</w:t>
-      </w:r>
-    </w:p>
-    <w:p>
-      <w:pPr>
-        <w:pStyle w:val="ListNumber"/>
-      </w:pPr>
-      <w:r>
-        <w:t>Comprobar los importes originales.</w:t>
-      </w:r>
-    </w:p>
-    <w:p>
-      <w:pPr>
-        <w:pStyle w:val="ListNumber"/>
-      </w:pPr>
-      <w:r>
-        <w:t>Conservar la trazabilidad de las revisiones.</w:t>
+        <w:t>01  /  DATOS ECONÓMICOS</w:t>
       </w:r>
     </w:p>
     <w:p>
@@ -67,15 +59,23 @@
         <w:t>Detalle de importes</w:t>
       </w:r>
     </w:p>
+    <w:p>
+      <w:pPr>
+        <w:pStyle w:val="Subtitle"/>
+      </w:pPr>
+      <w:r>
+        <w:t>Desglose por concepto, expresado en euros.</w:t>
+      </w:r>
+    </w:p>
     <w:tbl>
       <w:tblPr>
-        <w:tblStyle w:val="LightShading-Accent1"/>
         <w:tblW w:type="auto" w:w="0"/>
+        <w:tblLayout w:type="fixed"/>
         <w:tblLook w:firstColumn="1" w:firstRow="1" w:lastColumn="0" w:lastRow="0" w:noHBand="0" w:noVBand="1" w:val="04A0"/>
       </w:tblPr>
       <w:tblGrid>
-        <w:gridCol w:w="4730"/>
-        <w:gridCol w:w="4730"/>
+        <w:gridCol w:w="6912"/>
+        <w:gridCol w:w="2520"/>
       </w:tblGrid>
       <w:tr>
         <w:trPr>
@@ -83,20 +83,40 @@
         </w:trPr>
         <w:tc>
           <w:tcPr>
-            <w:tcW w:type="dxa" w:w="4730"/>
+            <w:tcW w:type="dxa" w:w="6912"/>
+            <w:shd w:fill="193B45"/>
           </w:tcPr>
           <w:p>
+            <w:pPr>
+              <w:spacing w:before="160" w:after="160"/>
+              <w:jc w:val="left"/>
+            </w:pPr>
             <w:r>
+              <w:rPr>
+                <w:b/>
+                <w:color w:val="FFFFFF"/>
+                <w:sz w:val="20"/>
+              </w:rPr>
               <w:t>Concepto</w:t>
             </w:r>
           </w:p>
         </w:tc>
         <w:tc>
           <w:tcPr>
-            <w:tcW w:type="dxa" w:w="4730"/>
+            <w:tcW w:type="dxa" w:w="2520"/>
+            <w:shd w:fill="193B45"/>
           </w:tcPr>
           <w:p>
+            <w:pPr>
+              <w:spacing w:before="160" w:after="160"/>
+              <w:jc w:val="right"/>
+            </w:pPr>
             <w:r>
+              <w:rPr>
+                <w:b/>
+                <w:color w:val="FFFFFF"/>
+                <w:sz w:val="20"/>
+              </w:rPr>
               <w:t>Importe (€)</w:t>
             </w:r>
           </w:p>
@@ -105,36 +125,40 @@
       <w:tr>
         <w:tc>
           <w:tcPr>
-            <w:tcW w:type="dxa" w:w="4730"/>
+            <w:tcW w:type="dxa" w:w="6912"/>
           </w:tcPr>
           <w:p>
+            <w:pPr>
+              <w:spacing w:before="160" w:after="160"/>
+              <w:jc w:val="left"/>
+            </w:pPr>
             <w:r>
+              <w:rPr>
+                <w:sz w:val="20"/>
+              </w:rPr>
               <w:t>{{ITEM}}</w:t>
             </w:r>
           </w:p>
         </w:tc>
         <w:tc>
           <w:tcPr>
-            <w:tcW w:type="dxa" w:w="4730"/>
+            <w:tcW w:type="dxa" w:w="2520"/>
           </w:tcPr>
           <w:p>
+            <w:pPr>
+              <w:spacing w:before="160" w:after="160"/>
+              <w:jc w:val="right"/>
+            </w:pPr>
             <w:r>
+              <w:rPr>
+                <w:sz w:val="20"/>
+              </w:rPr>
               <w:t>{{AMOUNT}}</w:t>
             </w:r>
           </w:p>
         </w:tc>
       </w:tr>
     </w:tbl>
-    <w:p>
-      <w:pPr>
-        <w:sectPr>
-          <w:pgSz w:w="11909" w:h="16834"/>
-          <w:pgMar w:top="1152" w:right="1224" w:bottom="1152" w:left="1224" w:header="720" w:footer="720" w:gutter="0"/>
-          <w:cols w:space="720"/>
-          <w:docGrid w:linePitch="360"/>
-        </w:sectPr>
-      </w:pPr>
-    </w:p>
     <w:p>
       <w:pPr>
         <w:pStyle w:val="Heading1"/>
@@ -145,7 +169,23 @@
     </w:p>
     <w:p>
       <w:r>
-        <w:t>Los importes se expresan en euros. Año 2026; revisión técnica.</w:t>
+        <w:t>Cada fila corresponde a un concepto del archivo de origen. El total suma todos los importes en céntimos antes de expresarlos en euros.</w:t>
+      </w:r>
+    </w:p>
+    <w:p>
+      <w:pPr>
+        <w:pStyle w:val="ListNumber"/>
+      </w:pPr>
+      <w:r>
+        <w:t>Contrastar los conceptos con el archivo de origen.</w:t>
+      </w:r>
+    </w:p>
+    <w:p>
+      <w:pPr>
+        <w:pStyle w:val="ListNumber"/>
+      </w:pPr>
+      <w:r>
+        <w:t>Revisar el total antes de utilizar este informe.</w:t>
       </w:r>
     </w:p>
     <w:sectPr>
@@ -162,7 +202,7 @@
 <w:ftr xmlns:m="http://schemas.openxmlformats.org/officeDocument/2006/math" xmlns:mc="http://schemas.openxmlformats.org/markup-compatibility/2006" xmlns:mo="http://schemas.microsoft.com/office/mac/office/2008/main" xmlns:mv="urn:schemas-microsoft-com:mac:vml" xmlns:o="urn:schemas-microsoft-com:office:office" xmlns:r="http://schemas.openxmlformats.org/officeDocument/2006/relationships" xmlns:v="urn:schemas-microsoft-com:vml" xmlns:w10="urn:schemas-microsoft-com:office:word" xmlns:w14="http://schemas.microsoft.com/office/word/2010/wordml" xmlns:w="http://schemas.openxmlformats.org/wordprocessingml/2006/main" xmlns:wne="http://schemas.microsoft.com/office/word/2006/wordml" xmlns:wp14="http://schemas.microsoft.com/office/word/2010/wordprocessingDrawing" xmlns:wp="http://schemas.openxmlformats.org/drawingml/2006/wordprocessingDrawing" xmlns:wpc="http://schemas.microsoft.com/office/word/2010/wordprocessingCanvas" xmlns:wpg="http://schemas.microsoft.com/office/word/2010/wordprocessingGroup" xmlns:wpi="http://schemas.microsoft.com/office/word/2010/wordprocessingInk" xmlns:wps="http://schemas.microsoft.com/office/word/2010/wordprocessingShape" mc:Ignorable="w14 wp14">
   <w:p>
     <w:pPr>
-      <w:pStyle w:val="Footer"/>
+      <w:pStyle w:val="Subtitle"/>
     </w:pPr>
     <w:r>
       <w:t xml:space="preserve">Página </w:t>
@@ -182,7 +222,11 @@
       <w:pStyle w:val="Header"/>
     </w:pPr>
     <w:r>
-      <w:t>REGULAY · ÁREA TÉCNICA</w:t>
+      <w:rPr>
+        <w:b/>
+        <w:sz w:val="18"/>
+      </w:rPr>
+      <w:t>REGULAY  /  INFORMES</w:t>
     </w:r>
   </w:p>
 </w:hdr>
@@ -551,9 +595,12 @@
     <w:name w:val="Normal"/>
     <w:qFormat/>
     <w:rsid w:val="00FC693F"/>
+    <w:pPr>
+      <w:spacing w:after="180" w:line="276" w:lineRule="auto"/>
+    </w:pPr>
     <w:rPr>
       <w:rFonts w:ascii="Liberation Sans" w:hAnsi="Liberation Sans"/>
-      <w:color w:val="222222"/>
+      <w:color w:val="263D44"/>
       <w:sz w:val="22"/>
     </w:rPr>
   </w:style>
@@ -612,15 +659,15 @@
     <w:pPr>
       <w:keepNext/>
       <w:keepLines/>
-      <w:spacing w:before="480" w:after="0"/>
+      <w:spacing w:before="480" w:after="240"/>
       <w:outlineLvl w:val="0"/>
     </w:pPr>
     <w:rPr>
-      <w:rFonts w:asciiTheme="majorHAnsi" w:eastAsiaTheme="majorEastAsia" w:hAnsiTheme="majorHAnsi" w:cstheme="majorBidi" w:ascii="Liberation Sans" w:hAnsi="Liberation Sans"/>
+      <w:rFonts w:ascii="Liberation Sans" w:hAnsi="Liberation Sans"/>
       <w:b/>
       <w:bCs/>
-      <w:color w:val="17365D"/>
-      <w:sz w:val="28"/>
+      <w:color w:val="193B45"/>
+      <w:sz w:val="40"/>
       <w:szCs w:val="28"/>
     </w:rPr>
   </w:style>
@@ -640,10 +687,10 @@
       <w:outlineLvl w:val="1"/>
     </w:pPr>
     <w:rPr>
-      <w:rFonts w:asciiTheme="majorHAnsi" w:eastAsiaTheme="majorEastAsia" w:hAnsiTheme="majorHAnsi" w:cstheme="majorBidi" w:ascii="Liberation Sans" w:hAnsi="Liberation Sans"/>
+      <w:rFonts w:ascii="Liberation Sans" w:hAnsi="Liberation Sans"/>
       <w:b/>
       <w:bCs/>
-      <w:color w:val="17365D"/>
+      <w:color w:val="193B45"/>
       <w:sz w:val="26"/>
       <w:szCs w:val="26"/>
     </w:rPr>
@@ -898,18 +945,15 @@
     <w:qFormat/>
     <w:rsid w:val="00FC693F"/>
     <w:pPr>
-      <w:pBdr>
-        <w:bottom w:val="single" w:sz="8" w:space="4" w:color="4F81BD" w:themeColor="accent1"/>
-      </w:pBdr>
-      <w:spacing w:after="300" w:line="240" w:lineRule="auto"/>
+      <w:spacing w:after="480" w:line="240" w:lineRule="auto" w:before="1040"/>
       <w:contextualSpacing/>
     </w:pPr>
     <w:rPr>
-      <w:rFonts w:asciiTheme="majorHAnsi" w:eastAsiaTheme="majorEastAsia" w:hAnsiTheme="majorHAnsi" w:cstheme="majorBidi" w:ascii="Liberation Sans" w:hAnsi="Liberation Sans"/>
-      <w:color w:val="17365D"/>
+      <w:rFonts w:ascii="Liberation Serif" w:hAnsi="Liberation Serif"/>
+      <w:color w:val="193B45"/>
       <w:spacing w:val="5"/>
       <w:kern w:val="28"/>
-      <w:sz w:val="52"/>
+      <w:sz w:val="76"/>
       <w:szCs w:val="52"/>
     </w:rPr>
   </w:style>
@@ -942,12 +986,12 @@
       </w:numPr>
     </w:pPr>
     <w:rPr>
-      <w:rFonts w:asciiTheme="majorHAnsi" w:eastAsiaTheme="majorEastAsia" w:hAnsiTheme="majorHAnsi" w:cstheme="majorBidi" w:ascii="Liberation Sans" w:hAnsi="Liberation Sans"/>
+      <w:rFonts w:ascii="Liberation Sans" w:hAnsi="Liberation Sans"/>
       <w:i/>
       <w:iCs/>
-      <w:color w:val="17365D"/>
+      <w:color w:val="5F7479"/>
       <w:spacing w:val="15"/>
-      <w:sz w:val="24"/>
+      <w:sz w:val="20"/>
       <w:szCs w:val="24"/>
     </w:rPr>
   </w:style>
@@ -1126,7 +1170,7 @@
     </w:pPr>
     <w:rPr>
       <w:rFonts w:ascii="Liberation Sans" w:hAnsi="Liberation Sans"/>
-      <w:color w:val="17365D"/>
+      <w:color w:val="193B45"/>
     </w:rPr>
   </w:style>
   <w:style w:type="paragraph" w:styleId="ListNumber2">

</xml_diff>